<commit_message>
style(file): refine docx/xlsx/pptx office preview presentation
The office previews rendered raw: docx text ran edge-to-edge on a stark
grey desk, the xlsx grid was an undifferentiated wall of cells, and pptx
slides clipped past the modal's right edge. Dress each format as a
document on a soft neutral desk, using design tokens throughout:

- docx: reclaim the library's grey wrapper to var(--blok-bg-secondary),
  give pages a rounded, lightly-shadowed paper frame, and add real 1in
  page margins + line/heading spacing to the sample doc so text breathes.
- xlsx: render as one crisp data card — header band, zebra rows, rounded
  border, soft shadow.
- pptx: stack slides as shadowed cards. The renderer hard-sizes each slide
  to the container's clientWidth (padding included), so horizontal padding
  or a border would overflow; keep sides flush and frame via shadow+radius.

Co-Authored-By: Claude Opus 4.8 (1M context) <noreply@anthropic.com>
</commit_message>
<xml_diff>
--- a/public/samples/service-agreement.docx
+++ b/public/samples/service-agreement.docx
@@ -4,75 +4,107 @@
   <w:body>
     <w:p>
       <w:pPr>
-        <w:spacing w:before="240" w:after="120"/>
+        <w:spacing w:after="240" w:line="276" w:lineRule="auto"/>
       </w:pPr>
       <w:r>
         <w:rPr>
           <w:b/>
-          <w:sz w:val="32"/>
+          <w:sz w:val="40"/>
         </w:rPr>
         <w:t xml:space="preserve">Service Agreement</w:t>
       </w:r>
     </w:p>
     <w:p>
+      <w:pPr>
+        <w:spacing w:after="160" w:line="276" w:lineRule="auto"/>
+      </w:pPr>
       <w:r>
         <w:t xml:space="preserve">This Service Agreement ("Agreement") is entered into as of June 16, 2026, by and between Blok Software Inc. ("Provider") and the undersigned client ("Client").</w:t>
       </w:r>
     </w:p>
     <w:p>
+      <w:pPr>
+        <w:spacing w:before="280" w:after="80" w:line="276" w:lineRule="auto"/>
+      </w:pPr>
       <w:r>
         <w:rPr>
           <w:b/>
+          <w:sz w:val="24"/>
         </w:rPr>
         <w:t xml:space="preserve">1. Scope of Services</w:t>
       </w:r>
     </w:p>
     <w:p>
+      <w:pPr>
+        <w:spacing w:after="160" w:line="276" w:lineRule="auto"/>
+      </w:pPr>
       <w:r>
         <w:t xml:space="preserve">Provider shall deliver and maintain the Blok block-based editor, including hosting, support, and periodic feature updates, for the duration of this Agreement.</w:t>
       </w:r>
     </w:p>
     <w:p>
+      <w:pPr>
+        <w:spacing w:before="280" w:after="80" w:line="276" w:lineRule="auto"/>
+      </w:pPr>
       <w:r>
         <w:rPr>
           <w:b/>
+          <w:sz w:val="24"/>
         </w:rPr>
         <w:t xml:space="preserve">2. Term</w:t>
       </w:r>
     </w:p>
     <w:p>
+      <w:pPr>
+        <w:spacing w:after="160" w:line="276" w:lineRule="auto"/>
+      </w:pPr>
       <w:r>
         <w:t xml:space="preserve">This Agreement commences on the effective date above and continues for an initial term of twelve (12) months, renewing automatically unless either party provides thirty (30) days written notice.</w:t>
       </w:r>
     </w:p>
     <w:p>
+      <w:pPr>
+        <w:spacing w:before="280" w:after="80" w:line="276" w:lineRule="auto"/>
+      </w:pPr>
       <w:r>
         <w:rPr>
           <w:b/>
+          <w:sz w:val="24"/>
         </w:rPr>
         <w:t xml:space="preserve">3. Fees</w:t>
       </w:r>
     </w:p>
     <w:p>
+      <w:pPr>
+        <w:spacing w:after="160" w:line="276" w:lineRule="auto"/>
+      </w:pPr>
       <w:r>
         <w:t xml:space="preserve">Client agrees to pay the monthly subscription fee set out in the order form. Fees are due within fifteen (15) days of each invoice date.</w:t>
       </w:r>
     </w:p>
     <w:p>
+      <w:pPr>
+        <w:spacing w:before="280" w:after="80" w:line="276" w:lineRule="auto"/>
+      </w:pPr>
       <w:r>
         <w:rPr>
           <w:b/>
+          <w:sz w:val="24"/>
         </w:rPr>
         <w:t xml:space="preserve">4. Confidentiality</w:t>
       </w:r>
     </w:p>
     <w:p>
+      <w:pPr>
+        <w:spacing w:after="160" w:line="276" w:lineRule="auto"/>
+      </w:pPr>
       <w:r>
         <w:t xml:space="preserve">Each party shall protect the other party’s confidential information with the same degree of care it uses for its own, and no less than reasonable care.</w:t>
       </w:r>
     </w:p>
     <w:sectPr>
       <w:pgSz w:w="12240" w:h="15840"/>
+      <w:pgMar w:top="1440" w:right="1440" w:bottom="1440" w:left="1440" w:header="720" w:footer="720" w:gutter="0"/>
     </w:sectPr>
   </w:body>
 </w:document>

</xml_diff>